<commit_message>
Rumus Perpangkatan Universal 10.0 || (21:15 (W . I . B[Waktu Indonesia bagian Barat]), 24/09/2026), Jonggol, Bogor, Indonesia || #NOBELSNOINDONESIANYES #LAWANPEMERINTAHINDONESIAKORUPPENINDASRAKYATINDONESIADENGANPENGETAHUAN #LAWANKEMISKINANDENGANPENDIDIKAN #HIDUPMAHASISWA #HIDUPRAKYATINDONESIA #HIDUPWANGSAINDONESIA #17081945
Rumus Perpangkatan Universal 10.0 || (21:15 (W . I . B[Waktu Indonesia bagian Barat]), 24/09/2026), Jonggol, Bogor, Indonesia || #NOBELSNOINDONESIANYES #LAWANPEMERINTAHINDONESIAKORUPPENINDASRAKYATINDONESIADENGANPENGETAHUAN #LAWANKEMISKINANDENGANPENDIDIKAN #HIDUPMAHASISWA #HIDUPRAKYATINDONESIA #HIDUPWANGSAINDONESIA #17081945
</commit_message>
<xml_diff>
--- a/Rumus Perpangkatan Universal 10.0.docx
+++ b/Rumus Perpangkatan Universal 10.0.docx
@@ -13,13 +13,41 @@
           <w:lang w:val="id-ID"/>
         </w:rPr>
       </w:pPr>
+      <w:proofErr w:type="spellStart"/>
       <w:r>
         <w:rPr>
           <w:rFonts w:ascii="Times New Roman" w:eastAsiaTheme="minorEastAsia" w:hAnsi="Times New Roman" w:cs="Times New Roman"/>
           <w:sz w:val="24"/>
           <w:szCs w:val="24"/>
         </w:rPr>
-        <w:t xml:space="preserve">Rumus Perpangkatan Universal </w:t>
+        <w:t>Rumus</w:t>
+      </w:r>
+      <w:proofErr w:type="spellEnd"/>
+      <w:r>
+        <w:rPr>
+          <w:rFonts w:ascii="Times New Roman" w:eastAsiaTheme="minorEastAsia" w:hAnsi="Times New Roman" w:cs="Times New Roman"/>
+          <w:sz w:val="24"/>
+          <w:szCs w:val="24"/>
+        </w:rPr>
+        <w:t xml:space="preserve"> </w:t>
+      </w:r>
+      <w:proofErr w:type="spellStart"/>
+      <w:r>
+        <w:rPr>
+          <w:rFonts w:ascii="Times New Roman" w:eastAsiaTheme="minorEastAsia" w:hAnsi="Times New Roman" w:cs="Times New Roman"/>
+          <w:sz w:val="24"/>
+          <w:szCs w:val="24"/>
+        </w:rPr>
+        <w:t>Perpangkatan</w:t>
+      </w:r>
+      <w:proofErr w:type="spellEnd"/>
+      <w:r>
+        <w:rPr>
+          <w:rFonts w:ascii="Times New Roman" w:eastAsiaTheme="minorEastAsia" w:hAnsi="Times New Roman" w:cs="Times New Roman"/>
+          <w:sz w:val="24"/>
+          <w:szCs w:val="24"/>
+        </w:rPr>
+        <w:t xml:space="preserve"> Universal </w:t>
       </w:r>
       <w:r>
         <w:rPr>
@@ -309,26 +337,10 @@
                     <w:sz w:val="24"/>
                     <w:szCs w:val="24"/>
                   </w:rPr>
-                  <m:t>x → ζ = 8,3</m:t>
+                  <m:t xml:space="preserve">x → ζ = </m:t>
                 </m:r>
-                <m:r>
-                  <w:rPr>
-                    <w:rFonts w:ascii="Cambria Math" w:hAnsi="Cambria Math" w:cs="Times New Roman"/>
-                    <w:sz w:val="24"/>
-                    <w:szCs w:val="24"/>
-                  </w:rPr>
-                  <m:t>2</m:t>
-                </m:r>
-                <m:r>
-                  <w:rPr>
-                    <w:rFonts w:ascii="Cambria Math" w:hAnsi="Cambria Math" w:cs="Times New Roman"/>
-                    <w:sz w:val="24"/>
-                    <w:szCs w:val="24"/>
-                  </w:rPr>
-                  <m:t xml:space="preserve">9416  .   .   .    </m:t>
-                </m:r>
-                <m:sSub>
-                  <m:sSubPr>
+                <m:d>
+                  <m:dPr>
                     <m:ctrlPr>
                       <w:rPr>
                         <w:rFonts w:ascii="Cambria Math" w:hAnsi="Cambria Math" w:cs="Times New Roman"/>
@@ -337,7 +349,7 @@
                         <w:szCs w:val="24"/>
                       </w:rPr>
                     </m:ctrlPr>
-                  </m:sSubPr>
+                  </m:dPr>
                   <m:e>
                     <m:r>
                       <w:rPr>
@@ -345,28 +357,50 @@
                         <w:sz w:val="24"/>
                         <w:szCs w:val="24"/>
                       </w:rPr>
-                      <m:t>6</m:t>
+                      <m:t xml:space="preserve"> -8,329416  .   .   .    </m:t>
                     </m:r>
-                  </m:e>
-                  <m:sub>
+                    <m:sSub>
+                      <m:sSubPr>
+                        <m:ctrlPr>
+                          <w:rPr>
+                            <w:rFonts w:ascii="Cambria Math" w:hAnsi="Cambria Math" w:cs="Times New Roman"/>
+                            <w:i/>
+                            <w:sz w:val="24"/>
+                            <w:szCs w:val="24"/>
+                          </w:rPr>
+                        </m:ctrlPr>
+                      </m:sSubPr>
+                      <m:e>
+                        <m:r>
+                          <w:rPr>
+                            <w:rFonts w:ascii="Cambria Math" w:hAnsi="Cambria Math" w:cs="Times New Roman"/>
+                            <w:sz w:val="24"/>
+                            <w:szCs w:val="24"/>
+                          </w:rPr>
+                          <m:t>6</m:t>
+                        </m:r>
+                      </m:e>
+                      <m:sub>
+                        <m:r>
+                          <w:rPr>
+                            <w:rFonts w:ascii="Cambria Math" w:hAnsi="Cambria Math" w:cs="Times New Roman"/>
+                            <w:sz w:val="24"/>
+                            <w:szCs w:val="24"/>
+                          </w:rPr>
+                          <m:t>n</m:t>
+                        </m:r>
+                      </m:sub>
+                    </m:sSub>
                     <m:r>
                       <w:rPr>
                         <w:rFonts w:ascii="Cambria Math" w:hAnsi="Cambria Math" w:cs="Times New Roman"/>
                         <w:sz w:val="24"/>
                         <w:szCs w:val="24"/>
                       </w:rPr>
-                      <m:t>n</m:t>
+                      <m:t>%</m:t>
                     </m:r>
-                  </m:sub>
-                </m:sSub>
-                <m:r>
-                  <w:rPr>
-                    <w:rFonts w:ascii="Cambria Math" w:hAnsi="Cambria Math" w:cs="Times New Roman"/>
-                    <w:sz w:val="24"/>
-                    <w:szCs w:val="24"/>
-                  </w:rPr>
-                  <m:t>%</m:t>
-                </m:r>
+                  </m:e>
+                </m:d>
               </m:e>
             </m:d>
           </m:sub>
@@ -427,26 +461,10 @@
                             <w:sz w:val="24"/>
                             <w:szCs w:val="24"/>
                           </w:rPr>
-                          <m:t>x → ζ = 8,3</m:t>
+                          <m:t xml:space="preserve">x → ζ = </m:t>
                         </m:r>
-                        <m:r>
-                          <w:rPr>
-                            <w:rFonts w:ascii="Cambria Math" w:hAnsi="Cambria Math" w:cs="Times New Roman"/>
-                            <w:sz w:val="24"/>
-                            <w:szCs w:val="24"/>
-                          </w:rPr>
-                          <m:t>2</m:t>
-                        </m:r>
-                        <m:r>
-                          <w:rPr>
-                            <w:rFonts w:ascii="Cambria Math" w:hAnsi="Cambria Math" w:cs="Times New Roman"/>
-                            <w:sz w:val="24"/>
-                            <w:szCs w:val="24"/>
-                          </w:rPr>
-                          <m:t xml:space="preserve">9416  .   .   .    </m:t>
-                        </m:r>
-                        <m:sSub>
-                          <m:sSubPr>
+                        <m:d>
+                          <m:dPr>
                             <m:ctrlPr>
                               <w:rPr>
                                 <w:rFonts w:ascii="Cambria Math" w:hAnsi="Cambria Math" w:cs="Times New Roman"/>
@@ -455,7 +473,7 @@
                                 <w:szCs w:val="24"/>
                               </w:rPr>
                             </m:ctrlPr>
-                          </m:sSubPr>
+                          </m:dPr>
                           <m:e>
                             <m:r>
                               <w:rPr>
@@ -463,28 +481,50 @@
                                 <w:sz w:val="24"/>
                                 <w:szCs w:val="24"/>
                               </w:rPr>
-                              <m:t>6</m:t>
+                              <m:t xml:space="preserve"> -8,329416  .   .   .    </m:t>
                             </m:r>
-                          </m:e>
-                          <m:sub>
+                            <m:sSub>
+                              <m:sSubPr>
+                                <m:ctrlPr>
+                                  <w:rPr>
+                                    <w:rFonts w:ascii="Cambria Math" w:hAnsi="Cambria Math" w:cs="Times New Roman"/>
+                                    <w:i/>
+                                    <w:sz w:val="24"/>
+                                    <w:szCs w:val="24"/>
+                                  </w:rPr>
+                                </m:ctrlPr>
+                              </m:sSubPr>
+                              <m:e>
+                                <m:r>
+                                  <w:rPr>
+                                    <w:rFonts w:ascii="Cambria Math" w:hAnsi="Cambria Math" w:cs="Times New Roman"/>
+                                    <w:sz w:val="24"/>
+                                    <w:szCs w:val="24"/>
+                                  </w:rPr>
+                                  <m:t>6</m:t>
+                                </m:r>
+                              </m:e>
+                              <m:sub>
+                                <m:r>
+                                  <w:rPr>
+                                    <w:rFonts w:ascii="Cambria Math" w:hAnsi="Cambria Math" w:cs="Times New Roman"/>
+                                    <w:sz w:val="24"/>
+                                    <w:szCs w:val="24"/>
+                                  </w:rPr>
+                                  <m:t>n</m:t>
+                                </m:r>
+                              </m:sub>
+                            </m:sSub>
                             <m:r>
                               <w:rPr>
                                 <w:rFonts w:ascii="Cambria Math" w:hAnsi="Cambria Math" w:cs="Times New Roman"/>
                                 <w:sz w:val="24"/>
                                 <w:szCs w:val="24"/>
                               </w:rPr>
-                              <m:t>n</m:t>
+                              <m:t>%</m:t>
                             </m:r>
-                          </m:sub>
-                        </m:sSub>
-                        <m:r>
-                          <w:rPr>
-                            <w:rFonts w:ascii="Cambria Math" w:hAnsi="Cambria Math" w:cs="Times New Roman"/>
-                            <w:sz w:val="24"/>
-                            <w:szCs w:val="24"/>
-                          </w:rPr>
-                          <m:t>%</m:t>
-                        </m:r>
+                          </m:e>
+                        </m:d>
                       </m:e>
                     </m:d>
                   </m:lim>
@@ -628,26 +668,10 @@
                     <w:sz w:val="24"/>
                     <w:szCs w:val="24"/>
                   </w:rPr>
-                  <m:t>x → ζ = 8,3</m:t>
+                  <m:t xml:space="preserve">x → ζ = </m:t>
                 </m:r>
-                <m:r>
-                  <w:rPr>
-                    <w:rFonts w:ascii="Cambria Math" w:hAnsi="Cambria Math" w:cs="Times New Roman"/>
-                    <w:sz w:val="24"/>
-                    <w:szCs w:val="24"/>
-                  </w:rPr>
-                  <m:t>2</m:t>
-                </m:r>
-                <m:r>
-                  <w:rPr>
-                    <w:rFonts w:ascii="Cambria Math" w:hAnsi="Cambria Math" w:cs="Times New Roman"/>
-                    <w:sz w:val="24"/>
-                    <w:szCs w:val="24"/>
-                  </w:rPr>
-                  <m:t xml:space="preserve">9416  .   .   .    </m:t>
-                </m:r>
-                <m:sSub>
-                  <m:sSubPr>
+                <m:d>
+                  <m:dPr>
                     <m:ctrlPr>
                       <w:rPr>
                         <w:rFonts w:ascii="Cambria Math" w:hAnsi="Cambria Math" w:cs="Times New Roman"/>
@@ -656,7 +680,7 @@
                         <w:szCs w:val="24"/>
                       </w:rPr>
                     </m:ctrlPr>
-                  </m:sSubPr>
+                  </m:dPr>
                   <m:e>
                     <m:r>
                       <w:rPr>
@@ -664,28 +688,50 @@
                         <w:sz w:val="24"/>
                         <w:szCs w:val="24"/>
                       </w:rPr>
-                      <m:t>6</m:t>
+                      <m:t xml:space="preserve"> -8,329416  .   .   .    </m:t>
                     </m:r>
-                  </m:e>
-                  <m:sub>
+                    <m:sSub>
+                      <m:sSubPr>
+                        <m:ctrlPr>
+                          <w:rPr>
+                            <w:rFonts w:ascii="Cambria Math" w:hAnsi="Cambria Math" w:cs="Times New Roman"/>
+                            <w:i/>
+                            <w:sz w:val="24"/>
+                            <w:szCs w:val="24"/>
+                          </w:rPr>
+                        </m:ctrlPr>
+                      </m:sSubPr>
+                      <m:e>
+                        <m:r>
+                          <w:rPr>
+                            <w:rFonts w:ascii="Cambria Math" w:hAnsi="Cambria Math" w:cs="Times New Roman"/>
+                            <w:sz w:val="24"/>
+                            <w:szCs w:val="24"/>
+                          </w:rPr>
+                          <m:t>6</m:t>
+                        </m:r>
+                      </m:e>
+                      <m:sub>
+                        <m:r>
+                          <w:rPr>
+                            <w:rFonts w:ascii="Cambria Math" w:hAnsi="Cambria Math" w:cs="Times New Roman"/>
+                            <w:sz w:val="24"/>
+                            <w:szCs w:val="24"/>
+                          </w:rPr>
+                          <m:t>n</m:t>
+                        </m:r>
+                      </m:sub>
+                    </m:sSub>
                     <m:r>
                       <w:rPr>
                         <w:rFonts w:ascii="Cambria Math" w:hAnsi="Cambria Math" w:cs="Times New Roman"/>
                         <w:sz w:val="24"/>
                         <w:szCs w:val="24"/>
                       </w:rPr>
-                      <m:t>n</m:t>
+                      <m:t>%</m:t>
                     </m:r>
-                  </m:sub>
-                </m:sSub>
-                <m:r>
-                  <w:rPr>
-                    <w:rFonts w:ascii="Cambria Math" w:hAnsi="Cambria Math" w:cs="Times New Roman"/>
-                    <w:sz w:val="24"/>
-                    <w:szCs w:val="24"/>
-                  </w:rPr>
-                  <m:t>%</m:t>
-                </m:r>
+                  </m:e>
+                </m:d>
               </m:e>
             </m:d>
           </m:sub>
@@ -746,26 +792,10 @@
                             <w:sz w:val="24"/>
                             <w:szCs w:val="24"/>
                           </w:rPr>
-                          <m:t>x → ζ = 8,3</m:t>
+                          <m:t xml:space="preserve">x → ζ = </m:t>
                         </m:r>
-                        <m:r>
-                          <w:rPr>
-                            <w:rFonts w:ascii="Cambria Math" w:hAnsi="Cambria Math" w:cs="Times New Roman"/>
-                            <w:sz w:val="24"/>
-                            <w:szCs w:val="24"/>
-                          </w:rPr>
-                          <m:t>2</m:t>
-                        </m:r>
-                        <m:r>
-                          <w:rPr>
-                            <w:rFonts w:ascii="Cambria Math" w:hAnsi="Cambria Math" w:cs="Times New Roman"/>
-                            <w:sz w:val="24"/>
-                            <w:szCs w:val="24"/>
-                          </w:rPr>
-                          <m:t xml:space="preserve">9416  .   .   .    </m:t>
-                        </m:r>
-                        <m:sSub>
-                          <m:sSubPr>
+                        <m:d>
+                          <m:dPr>
                             <m:ctrlPr>
                               <w:rPr>
                                 <w:rFonts w:ascii="Cambria Math" w:hAnsi="Cambria Math" w:cs="Times New Roman"/>
@@ -774,7 +804,7 @@
                                 <w:szCs w:val="24"/>
                               </w:rPr>
                             </m:ctrlPr>
-                          </m:sSubPr>
+                          </m:dPr>
                           <m:e>
                             <m:r>
                               <w:rPr>
@@ -782,28 +812,50 @@
                                 <w:sz w:val="24"/>
                                 <w:szCs w:val="24"/>
                               </w:rPr>
-                              <m:t>6</m:t>
+                              <m:t xml:space="preserve"> -8,329416  .   .   .    </m:t>
                             </m:r>
-                          </m:e>
-                          <m:sub>
+                            <m:sSub>
+                              <m:sSubPr>
+                                <m:ctrlPr>
+                                  <w:rPr>
+                                    <w:rFonts w:ascii="Cambria Math" w:hAnsi="Cambria Math" w:cs="Times New Roman"/>
+                                    <w:i/>
+                                    <w:sz w:val="24"/>
+                                    <w:szCs w:val="24"/>
+                                  </w:rPr>
+                                </m:ctrlPr>
+                              </m:sSubPr>
+                              <m:e>
+                                <m:r>
+                                  <w:rPr>
+                                    <w:rFonts w:ascii="Cambria Math" w:hAnsi="Cambria Math" w:cs="Times New Roman"/>
+                                    <w:sz w:val="24"/>
+                                    <w:szCs w:val="24"/>
+                                  </w:rPr>
+                                  <m:t>6</m:t>
+                                </m:r>
+                              </m:e>
+                              <m:sub>
+                                <m:r>
+                                  <w:rPr>
+                                    <w:rFonts w:ascii="Cambria Math" w:hAnsi="Cambria Math" w:cs="Times New Roman"/>
+                                    <w:sz w:val="24"/>
+                                    <w:szCs w:val="24"/>
+                                  </w:rPr>
+                                  <m:t>n</m:t>
+                                </m:r>
+                              </m:sub>
+                            </m:sSub>
                             <m:r>
                               <w:rPr>
                                 <w:rFonts w:ascii="Cambria Math" w:hAnsi="Cambria Math" w:cs="Times New Roman"/>
                                 <w:sz w:val="24"/>
                                 <w:szCs w:val="24"/>
                               </w:rPr>
-                              <m:t>n</m:t>
+                              <m:t>%</m:t>
                             </m:r>
-                          </m:sub>
-                        </m:sSub>
-                        <m:r>
-                          <w:rPr>
-                            <w:rFonts w:ascii="Cambria Math" w:hAnsi="Cambria Math" w:cs="Times New Roman"/>
-                            <w:sz w:val="24"/>
-                            <w:szCs w:val="24"/>
-                          </w:rPr>
-                          <m:t>%</m:t>
-                        </m:r>
+                          </m:e>
+                        </m:d>
                       </m:e>
                     </m:d>
                   </m:lim>
@@ -1024,15 +1076,7 @@
                                         <w:sz w:val="24"/>
                                         <w:szCs w:val="24"/>
                                       </w:rPr>
-                                      <m:t xml:space="preserve"> -1</m:t>
-                                    </m:r>
-                                    <m:r>
-                                      <w:rPr>
-                                        <w:rFonts w:ascii="Cambria Math" w:eastAsiaTheme="minorEastAsia" w:hAnsi="Cambria Math" w:cs="Times New Roman"/>
-                                        <w:sz w:val="24"/>
-                                        <w:szCs w:val="24"/>
-                                      </w:rPr>
-                                      <m:t>0</m:t>
+                                      <m:t xml:space="preserve"> -10</m:t>
                                     </m:r>
                                   </m:e>
                                 </m:d>
@@ -1056,15 +1100,7 @@
                                         <w:sz w:val="24"/>
                                         <w:szCs w:val="24"/>
                                       </w:rPr>
-                                      <m:t xml:space="preserve">a × </m:t>
-                                    </m:r>
-                                    <m:r>
-                                      <w:rPr>
-                                        <w:rFonts w:ascii="Cambria Math" w:eastAsiaTheme="minorEastAsia" w:hAnsi="Cambria Math" w:cs="Times New Roman"/>
-                                        <w:sz w:val="24"/>
-                                        <w:szCs w:val="24"/>
-                                      </w:rPr>
-                                      <m:t>k</m:t>
+                                      <m:t>a × k</m:t>
                                     </m:r>
                                   </m:e>
                                 </m:d>

</xml_diff>